<commit_message>
Batch 9: go-live hardening (10-character passwords, job lock, bundle splitting, accessibility, e2e and security CI)
</commit_message>
<xml_diff>
--- a/docs/06_System_Architecture_College_Institution_Management_System.docx
+++ b/docs/06_System_Architecture_College_Institution_Management_System.docx
@@ -397,7 +397,7 @@
                 <w:sz w:val="18"/>
                 <w:szCs w:val="18"/>
               </w:rPr>
-              <w:t xml:space="preserve">Version 3.1 — updated to the system as built after the October 2026 completion batches, for stakeholder review</w:t>
+              <w:t xml:space="preserve">Version 3.2 — updated to the system as built after the October 2026 completion batches, for stakeholder review</w:t>
             </w:r>
           </w:p>
         </w:tc>
@@ -1496,6 +1496,143 @@
                 <w:szCs w:val="18"/>
               </w:rPr>
               <w:t xml:space="preserve">Architecture as built (section 13) and the delivery note brought up to date after the completion batches (campuses and transfers; instalments, penalties and discounts; email; two-step sign-in, API clients and personal-data requests; data import and document uploads; configurable approval stages; alumni and tracer surveys; government adapters, deployment and load tests; the staff back-office in Kiswahili), including the frontend upgrade to Vite 8 and React Router 7. The version 2.0 design stays the target.</w:t>
+            </w:r>
+          </w:p>
+        </w:tc>
+      </w:tr>
+      <w:tr>
+        <w:trPr>
+          <w:cantSplit/>
+        </w:trPr>
+        <w:tc>
+          <w:tcPr>
+            <w:tcW w:type="dxa" w:w="1083"/>
+            <w:tcBorders>
+              <w:top w:val="single" w:color="BFC9D6" w:sz="4"/>
+              <w:left w:val="single" w:color="BFC9D6" w:sz="4"/>
+              <w:bottom w:val="single" w:color="BFC9D6" w:sz="4"/>
+              <w:right w:val="single" w:color="BFC9D6" w:sz="4"/>
+            </w:tcBorders>
+            <w:shd w:fill="EEF3F8" w:color="auto" w:val="clear"/>
+            <w:tcMar>
+              <w:top w:type="dxa" w:w="60"/>
+              <w:left w:type="dxa" w:w="100"/>
+              <w:bottom w:type="dxa" w:w="60"/>
+              <w:right w:type="dxa" w:w="100"/>
+            </w:tcMar>
+            <w:vAlign w:val="center"/>
+          </w:tcPr>
+          <w:p>
+            <w:pPr>
+              <w:spacing w:after="30" w:before="30"/>
+              <w:jc w:val="left"/>
+            </w:pPr>
+            <w:r>
+              <w:rPr>
+                <w:rFonts w:ascii="Calibri" w:cs="Calibri" w:eastAsia="Calibri" w:hAnsi="Calibri"/>
+                <w:sz w:val="18"/>
+                <w:szCs w:val="18"/>
+              </w:rPr>
+              <w:t xml:space="preserve">3.2</w:t>
+            </w:r>
+          </w:p>
+        </w:tc>
+        <w:tc>
+          <w:tcPr>
+            <w:tcW w:type="dxa" w:w="1624"/>
+            <w:tcBorders>
+              <w:top w:val="single" w:color="BFC9D6" w:sz="4"/>
+              <w:left w:val="single" w:color="BFC9D6" w:sz="4"/>
+              <w:bottom w:val="single" w:color="BFC9D6" w:sz="4"/>
+              <w:right w:val="single" w:color="BFC9D6" w:sz="4"/>
+            </w:tcBorders>
+            <w:shd w:fill="EEF3F8" w:color="auto" w:val="clear"/>
+            <w:tcMar>
+              <w:top w:type="dxa" w:w="60"/>
+              <w:left w:type="dxa" w:w="100"/>
+              <w:bottom w:type="dxa" w:w="60"/>
+              <w:right w:type="dxa" w:w="100"/>
+            </w:tcMar>
+            <w:vAlign w:val="center"/>
+          </w:tcPr>
+          <w:p>
+            <w:pPr>
+              <w:spacing w:after="30" w:before="30"/>
+              <w:jc w:val="left"/>
+            </w:pPr>
+            <w:r>
+              <w:rPr>
+                <w:rFonts w:ascii="Calibri" w:cs="Calibri" w:eastAsia="Calibri" w:hAnsi="Calibri"/>
+                <w:sz w:val="18"/>
+                <w:szCs w:val="18"/>
+              </w:rPr>
+              <w:t xml:space="preserve">October 2026</w:t>
+            </w:r>
+          </w:p>
+        </w:tc>
+        <w:tc>
+          <w:tcPr>
+            <w:tcW w:type="dxa" w:w="1985"/>
+            <w:tcBorders>
+              <w:top w:val="single" w:color="BFC9D6" w:sz="4"/>
+              <w:left w:val="single" w:color="BFC9D6" w:sz="4"/>
+              <w:bottom w:val="single" w:color="BFC9D6" w:sz="4"/>
+              <w:right w:val="single" w:color="BFC9D6" w:sz="4"/>
+            </w:tcBorders>
+            <w:shd w:fill="EEF3F8" w:color="auto" w:val="clear"/>
+            <w:tcMar>
+              <w:top w:type="dxa" w:w="60"/>
+              <w:left w:type="dxa" w:w="100"/>
+              <w:bottom w:type="dxa" w:w="60"/>
+              <w:right w:type="dxa" w:w="100"/>
+            </w:tcMar>
+            <w:vAlign w:val="center"/>
+          </w:tcPr>
+          <w:p>
+            <w:pPr>
+              <w:spacing w:after="30" w:before="30"/>
+              <w:jc w:val="left"/>
+            </w:pPr>
+            <w:r>
+              <w:rPr>
+                <w:rFonts w:ascii="Calibri" w:cs="Calibri" w:eastAsia="Calibri" w:hAnsi="Calibri"/>
+                <w:sz w:val="18"/>
+                <w:szCs w:val="18"/>
+              </w:rPr>
+              <w:t xml:space="preserve">Msingi Technologies Ltd</w:t>
+            </w:r>
+          </w:p>
+        </w:tc>
+        <w:tc>
+          <w:tcPr>
+            <w:tcW w:type="dxa" w:w="4334"/>
+            <w:tcBorders>
+              <w:top w:val="single" w:color="BFC9D6" w:sz="4"/>
+              <w:left w:val="single" w:color="BFC9D6" w:sz="4"/>
+              <w:bottom w:val="single" w:color="BFC9D6" w:sz="4"/>
+              <w:right w:val="single" w:color="BFC9D6" w:sz="4"/>
+            </w:tcBorders>
+            <w:shd w:fill="EEF3F8" w:color="auto" w:val="clear"/>
+            <w:tcMar>
+              <w:top w:type="dxa" w:w="60"/>
+              <w:left w:type="dxa" w:w="100"/>
+              <w:bottom w:type="dxa" w:w="60"/>
+              <w:right w:type="dxa" w:w="100"/>
+            </w:tcMar>
+            <w:vAlign w:val="center"/>
+          </w:tcPr>
+          <w:p>
+            <w:pPr>
+              <w:spacing w:after="30" w:before="30"/>
+              <w:jc w:val="left"/>
+            </w:pPr>
+            <w:r>
+              <w:rPr>
+                <w:rFonts w:ascii="Calibri" w:cs="Calibri" w:eastAsia="Calibri" w:hAnsi="Calibri"/>
+                <w:sz w:val="18"/>
+                <w:szCs w:val="18"/>
+              </w:rPr>
+              <w:t xml:space="preserve">Section 13 updated after Batch 9 (go-live hardening): passwords of at least 10 characters; scheduled jobs run once across several instances; the web app split into bundles loaded on demand; WCAG accessibility fixes; end-to-end tests in three browsers and security scans (Trivy, OWASP ZAP baseline, npm audit) in CI.</w:t>
             </w:r>
           </w:p>
         </w:tc>
@@ -14064,7 +14201,7 @@
                 <w:sz w:val="16"/>
                 <w:szCs w:val="16"/>
               </w:rPr>
-              <w:t xml:space="preserve">React 18.3, TypeScript 5, Vite 8, MUI 6, TanStack Query 5, React Router 7, i18next. The admission and student portals use i18next; the staff back-office is translated as it renders by a JSX runtime of its own with a dictionary of about 4,000 entries, so every screen is in English and Kiswahili. One application serves the admission portal, student portal, staff back-office, platform console and verification page; served by Nginx. Installable, with a service worker that keeps the app shell (never personal data) available offline.</w:t>
+              <w:t xml:space="preserve">React 18.3, TypeScript 5, Vite 8, MUI 6, TanStack Query 5, React Router 7, i18next. The admission and student portals use i18next; the staff back-office is translated as it renders by a JSX runtime of its own with a dictionary of about 4,000 entries, so every screen is in English and Kiswahili. One application serves the admission portal, student portal, staff back-office, platform console and verification page; served by Nginx. Installable, with a service worker that keeps the app shell (never personal data) available offline. Each part (admission portal, student portal, back-office, platform console) is a separate bundle fetched when first opened, and the Kiswahili dictionary only when Kiswahili is chosen, so the admission portal starts with about 200 kB compressed.</w:t>
             </w:r>
           </w:p>
         </w:tc>
@@ -14273,7 +14410,7 @@
                 <w:sz w:val="16"/>
                 <w:szCs w:val="16"/>
               </w:rPr>
-              <w:t xml:space="preserve">PostgreSQL 16 with forced row-level security; Flyway V1–V49. pg_trgm is not used yet.</w:t>
+              <w:t xml:space="preserve">PostgreSQL 16 with forced row-level security; Flyway V1–V50. pg_trgm is not used yet.</w:t>
             </w:r>
           </w:p>
         </w:tc>
@@ -14585,7 +14722,7 @@
                 <w:sz w:val="16"/>
                 <w:szCs w:val="16"/>
               </w:rPr>
-              <w:t xml:space="preserve">Not used. SMS and email go through transactional outbox tables sent after commit with retries; eleven scheduled jobs run inside the application (check-in closing, SMS retries, email retries, window closing, offer expiry, hostel release, status changes, fee reminders and penalties, scheduled reports, retention, integration log clean-up). ShedLock is needed before running more than one instance.</w:t>
+              <w:t xml:space="preserve">Not used. SMS and email go through transactional outbox tables sent after commit with retries; eleven scheduled jobs run inside the application (check-in closing, SMS retries, email retries, window closing, offer expiry, hostel release, status changes, fee reminders and penalties, scheduled reports, retention, integration log clean-up). Each job takes a database lock first (job_locks, as ShedLock does), so it runs once when several instances run.</w:t>
             </w:r>
           </w:p>
         </w:tc>
@@ -15318,7 +15455,7 @@
                 <w:sz w:val="16"/>
                 <w:szCs w:val="16"/>
               </w:rPr>
-              <w:t xml:space="preserve">GitHub Actions for continuous integration and load tests; Nginx TLS proxy in the production stack; Actuator health and Prometheus metrics, reachable inside the network only. Grafana, Loki, SonarQube, Trivy and ZAP come with production hosting.</w:t>
+              <w:t xml:space="preserve">GitHub Actions for continuous integration, end-to-end and accessibility tests in three browsers, Trivy and OWASP ZAP baseline scans, and load tests; Nginx TLS proxy in the production stack; Actuator health and Prometheus metrics, reachable inside the network only. Grafana, Loki and SonarQube come with production hosting.</w:t>
             </w:r>
           </w:p>
         </w:tc>
@@ -15421,7 +15558,7 @@
                 <w:sz w:val="16"/>
                 <w:szCs w:val="16"/>
               </w:rPr>
-              <w:t xml:space="preserve">JUnit 5 with Spring Boot tests against a real PostgreSQL database (239 tests) and Vitest unit tests for the frontend; screens checked with Playwright scripts; simulators of NACTVET (nactvet-mock) and of GePG, HESLB, NIDA, MUSE and TAMISEMI (gov-mocks); k6 and Locust load tests (100 users on the development machine: no errors, p95 37 ms, p99 1.0 s).</w:t>
+              <w:t xml:space="preserve">JUnit 5 with Spring Boot tests against a real PostgreSQL database (244 tests) and Vitest unit tests for the frontend; Playwright end-to-end and axe accessibility tests in Chromium, Firefox and WebKit; simulators of NACTVET (nactvet-mock) and of GePG, HESLB, NIDA, MUSE and TAMISEMI (gov-mocks); k6 and Locust load tests (100 users on the development machine: no errors, p95 37 ms, p99 1.0 s).</w:t>
             </w:r>
           </w:p>
         </w:tc>
@@ -18034,13 +18171,7 @@
           <w:b/>
           <w:bCs/>
         </w:rPr>
-        <w:t xml:space="preserve">Scale-out:</w:t>
-      </w:r>
-      <w:r>
-        <w:rPr>
-          <w:rFonts w:ascii="Calibri" w:cs="Calibri" w:eastAsia="Calibri" w:hAnsi="Calibri"/>
-        </w:rPr>
-        <w:t xml:space="preserve"> add ShedLock to the scheduled jobs, then run several backend instances behind the ingress; move bulk work to workers with a broker when volumes require.</w:t>
+        <w:t xml:space="preserve">Scale-out: run several backend instances behind the ingress (scheduled jobs already take a database lock); move bulk work to workers with a broker when volumes require.</w:t>
       </w:r>
     </w:p>
     <w:p>
@@ -18076,7 +18207,7 @@
           <w:b/>
           <w:bCs/>
         </w:rPr>
-        <w:t xml:space="preserve">Operations: Kubernetes manifests, ingress with automatic certificates, Grafana and Loki on the existing metrics and logs, image and dependency scanning, the peak load test on staging hardware and an independent penetration test before go-live. Continuous integration, backups with point-in-time recovery and load-test scripts are in place.</w:t>
+        <w:t xml:space="preserve">Operations: Kubernetes manifests, ingress with automatic certificates, Grafana and Loki on the existing metrics and logs, the peak load test on staging hardware and an independent penetration test before go-live. Continuous integration with dependency, secret and Dockerfile scanning, a ZAP baseline and browser tests, backups with point-in-time recovery and load-test scripts are in place.</w:t>
       </w:r>
     </w:p>
     <w:p>

</xml_diff>

<commit_message>
Students' health insurance with NHIF: own cards checked with NHIF, contributions billed, paid students registered with NHIF, cover before semester registration
</commit_message>
<xml_diff>
--- a/docs/06_System_Architecture_College_Institution_Management_System.docx
+++ b/docs/06_System_Architecture_College_Institution_Management_System.docx
@@ -22967,7 +22967,7 @@
                 <w:sz w:val="16"/>
                 <w:szCs w:val="16"/>
               </w:rPr>
-              <w:t xml:space="preserve">NECTA, NACTVET, HESLB, NIDA, MUSE and TAMISEMI clients, the institution's integration settings, integration call log; administrative areas and school lists.</w:t>
+              <w:t xml:space="preserve">NECTA, NACTVET, HESLB, NIDA, MUSE, TAMISEMI and NHIF clients, the institution's integration settings, integration call log; administrative areas and school lists.</w:t>
             </w:r>
           </w:p>
         </w:tc>
@@ -24276,6 +24276,109 @@
                 <w:szCs w:val="16"/>
               </w:rPr>
               <w:t xml:space="preserve">Selections fetched into the checked import, then verified and offered like other applicants.</w:t>
+            </w:r>
+          </w:p>
+        </w:tc>
+      </w:tr>
+      <w:tr>
+        <w:trPr>
+          <w:cantSplit/>
+        </w:trPr>
+        <w:tc>
+          <w:tcPr>
+            <w:tcW w:type="dxa" w:w="1624"/>
+            <w:tcBorders>
+              <w:top w:val="single" w:color="BFC9D6" w:sz="4"/>
+              <w:left w:val="single" w:color="BFC9D6" w:sz="4"/>
+              <w:bottom w:val="single" w:color="BFC9D6" w:sz="4"/>
+              <w:right w:val="single" w:color="BFC9D6" w:sz="4"/>
+            </w:tcBorders>
+            <w:tcMar>
+              <w:top w:type="dxa" w:w="60"/>
+              <w:left w:type="dxa" w:w="100"/>
+              <w:bottom w:type="dxa" w:w="60"/>
+              <w:right w:type="dxa" w:w="100"/>
+            </w:tcMar>
+            <w:vAlign w:val="center"/>
+          </w:tcPr>
+          <w:p>
+            <w:pPr>
+              <w:spacing w:after="30" w:before="30"/>
+              <w:jc w:val="left"/>
+            </w:pPr>
+            <w:r>
+              <w:rPr>
+                <w:rFonts w:ascii="Calibri" w:cs="Calibri" w:eastAsia="Calibri" w:hAnsi="Calibri"/>
+                <w:b/>
+                <w:bCs/>
+                <w:sz w:val="16"/>
+                <w:szCs w:val="16"/>
+              </w:rPr>
+              <w:t xml:space="preserve">NHIF</w:t>
+            </w:r>
+          </w:p>
+        </w:tc>
+        <w:tc>
+          <w:tcPr>
+            <w:tcW w:type="dxa" w:w="2707"/>
+            <w:tcBorders>
+              <w:top w:val="single" w:color="BFC9D6" w:sz="4"/>
+              <w:left w:val="single" w:color="BFC9D6" w:sz="4"/>
+              <w:bottom w:val="single" w:color="BFC9D6" w:sz="4"/>
+              <w:right w:val="single" w:color="BFC9D6" w:sz="4"/>
+            </w:tcBorders>
+            <w:tcMar>
+              <w:top w:type="dxa" w:w="60"/>
+              <w:left w:type="dxa" w:w="100"/>
+              <w:bottom w:type="dxa" w:w="60"/>
+              <w:right w:type="dxa" w:w="100"/>
+            </w:tcMar>
+            <w:vAlign w:val="center"/>
+          </w:tcPr>
+          <w:p>
+            <w:pPr>
+              <w:spacing w:after="30" w:before="30"/>
+              <w:jc w:val="left"/>
+            </w:pPr>
+            <w:r>
+              <w:rPr>
+                <w:rFonts w:ascii="Calibri" w:cs="Calibri" w:eastAsia="Calibri" w:hAnsi="Calibri"/>
+                <w:sz w:val="16"/>
+                <w:szCs w:val="16"/>
+              </w:rPr>
+              <w:t xml:space="preserve">CIMS_NHIF_MODE = simulated | live</w:t>
+            </w:r>
+          </w:p>
+        </w:tc>
+        <w:tc>
+          <w:tcPr>
+            <w:tcW w:type="dxa" w:w="4695"/>
+            <w:tcBorders>
+              <w:top w:val="single" w:color="BFC9D6" w:sz="4"/>
+              <w:left w:val="single" w:color="BFC9D6" w:sz="4"/>
+              <w:bottom w:val="single" w:color="BFC9D6" w:sz="4"/>
+              <w:right w:val="single" w:color="BFC9D6" w:sz="4"/>
+            </w:tcBorders>
+            <w:tcMar>
+              <w:top w:type="dxa" w:w="60"/>
+              <w:left w:type="dxa" w:w="100"/>
+              <w:bottom w:type="dxa" w:w="60"/>
+              <w:right w:type="dxa" w:w="100"/>
+            </w:tcMar>
+            <w:vAlign w:val="center"/>
+          </w:tcPr>
+          <w:p>
+            <w:pPr>
+              <w:spacing w:after="30" w:before="30"/>
+              <w:jc w:val="left"/>
+            </w:pPr>
+            <w:r>
+              <w:rPr>
+                <w:rFonts w:ascii="Calibri" w:cs="Calibri" w:eastAsia="Calibri" w:hAnsi="Calibri"/>
+                <w:sz w:val="16"/>
+                <w:szCs w:val="16"/>
+              </w:rPr>
+              <w:t xml:space="preserve">SimulatedNhifClient / LiveNhifClient (JSON over HTTPS, X-Api-Key): card verification, student-package registration in batches and their status; paths configurable until NHIF issues its interface; tested against gov-mocks.</w:t>
             </w:r>
           </w:p>
         </w:tc>

</xml_diff>

<commit_message>
Helpdesk: help pages, requests routed to offices with targets and escalation, knowledge base, support tickets to Msingi
</commit_message>
<xml_diff>
--- a/docs/06_System_Architecture_College_Institution_Management_System.docx
+++ b/docs/06_System_Architecture_College_Institution_Management_System.docx
@@ -21053,7 +21053,7 @@
                 <w:sz w:val="16"/>
                 <w:szCs w:val="16"/>
               </w:rPr>
-              <w:t xml:space="preserve">Not used. SMS and email go through transactional outbox tables sent after commit with retries; eleven scheduled jobs run inside the application (check-in closing, SMS retries, email retries, window closing, offer expiry, hostel release, status changes, fee reminders and penalties, scheduled reports, retention, integration log clean-up). Each job takes a database lock first (job_locks, as ShedLock does), so it runs once when several instances run.</w:t>
+              <w:t xml:space="preserve">Not used. SMS and email go through transactional outbox tables sent after commit with retries; twelve scheduled jobs run inside the application (check-in closing, SMS retries, email retries, window closing, offer expiry, hostel release, status changes, fee reminders and penalties, scheduled reports, retention, integration log clean-up, helpdesk targets and escalation). Each job takes a database lock first (job_locks, as ShedLock does), so it runs once when several instances run.</w:t>
             </w:r>
           </w:p>
         </w:tc>
@@ -22824,6 +22824,79 @@
                 <w:szCs w:val="16"/>
               </w:rPr>
               <w:t xml:space="preserve">Message templates, outbox, dispatcher, bulk campaigns, SMS bundles; email outbox.</w:t>
+            </w:r>
+          </w:p>
+        </w:tc>
+      </w:tr>
+      <w:tr>
+        <w:trPr>
+          <w:cantSplit/>
+        </w:trPr>
+        <w:tc>
+          <w:tcPr>
+            <w:tcW w:type="dxa" w:w="2166"/>
+            <w:tcBorders>
+              <w:top w:val="single" w:color="BFC9D6" w:sz="4"/>
+              <w:left w:val="single" w:color="BFC9D6" w:sz="4"/>
+              <w:bottom w:val="single" w:color="BFC9D6" w:sz="4"/>
+              <w:right w:val="single" w:color="BFC9D6" w:sz="4"/>
+            </w:tcBorders>
+            <w:shd w:fill="EEF3F8" w:color="auto" w:val="clear"/>
+            <w:tcMar>
+              <w:top w:type="dxa" w:w="60"/>
+              <w:left w:type="dxa" w:w="100"/>
+              <w:bottom w:type="dxa" w:w="60"/>
+              <w:right w:type="dxa" w:w="100"/>
+            </w:tcMar>
+            <w:vAlign w:val="center"/>
+          </w:tcPr>
+          <w:p>
+            <w:pPr>
+              <w:spacing w:after="30" w:before="30"/>
+              <w:jc w:val="left"/>
+            </w:pPr>
+            <w:r>
+              <w:rPr>
+                <w:rFonts w:ascii="Calibri" w:cs="Calibri" w:eastAsia="Calibri" w:hAnsi="Calibri"/>
+                <w:b/>
+                <w:bCs/>
+                <w:sz w:val="16"/>
+                <w:szCs w:val="16"/>
+              </w:rPr>
+              <w:t xml:space="preserve">helpdesk</w:t>
+            </w:r>
+          </w:p>
+        </w:tc>
+        <w:tc>
+          <w:tcPr>
+            <w:tcW w:type="dxa" w:w="6860"/>
+            <w:tcBorders>
+              <w:top w:val="single" w:color="BFC9D6" w:sz="4"/>
+              <w:left w:val="single" w:color="BFC9D6" w:sz="4"/>
+              <w:bottom w:val="single" w:color="BFC9D6" w:sz="4"/>
+              <w:right w:val="single" w:color="BFC9D6" w:sz="4"/>
+            </w:tcBorders>
+            <w:shd w:fill="EEF3F8" w:color="auto" w:val="clear"/>
+            <w:tcMar>
+              <w:top w:type="dxa" w:w="60"/>
+              <w:left w:type="dxa" w:w="100"/>
+              <w:bottom w:type="dxa" w:w="60"/>
+              <w:right w:type="dxa" w:w="100"/>
+            </w:tcMar>
+            <w:vAlign w:val="center"/>
+          </w:tcPr>
+          <w:p>
+            <w:pPr>
+              <w:spacing w:after="30" w:before="30"/>
+              <w:jc w:val="left"/>
+            </w:pPr>
+            <w:r>
+              <w:rPr>
+                <w:rFonts w:ascii="Calibri" w:cs="Calibri" w:eastAsia="Calibri" w:hAnsi="Calibri"/>
+                <w:sz w:val="16"/>
+                <w:szCs w:val="16"/>
+              </w:rPr>
+              <w:t xml:space="preserve">Help pages, requests routed by category to the answering office, targets and the escalation job, knowledge base; support tickets to Msingi (helpdesk.support).</w:t>
             </w:r>
           </w:p>
         </w:tc>

</xml_diff>

<commit_message>
Msingi billing: contracts, invoices (licence, usage, set-up), payments, collector callback, statements, reminders, suspension, institution subscription page (V58)
</commit_message>
<xml_diff>
--- a/docs/06_System_Architecture_College_Institution_Management_System.docx
+++ b/docs/06_System_Architecture_College_Institution_Management_System.docx
@@ -4461,7 +4461,7 @@
                 <w:szCs w:val="20"/>
               </w:rPr>
               <w:tab/>
-              <w:t>20</w:t>
+              <w:t>21</w:t>
             </w:r>
           </w:hyperlink>
         </w:p>
@@ -21053,7 +21053,7 @@
                 <w:sz w:val="16"/>
                 <w:szCs w:val="16"/>
               </w:rPr>
-              <w:t xml:space="preserve">Not used. SMS and email go through transactional outbox tables sent after commit with retries; twelve scheduled jobs run inside the application (check-in closing, SMS retries, email retries, window closing, offer expiry, hostel release, status changes, fee reminders and penalties, scheduled reports, retention, integration log clean-up, helpdesk targets and escalation). Each job takes a database lock first (job_locks, as ShedLock does), so it runs once when several instances run.</w:t>
+              <w:t xml:space="preserve">Not used. SMS and email go through transactional outbox tables sent after commit with retries; thirteen scheduled jobs run inside the application (check-in closing, SMS retries, email retries, window closing, offer expiry, hostel release, status changes, fee reminders and penalties, scheduled reports, retention, integration log clean-up, helpdesk targets and escalation, Msingi billing). Each job takes a database lock first (job_locks, as ShedLock does), so it runs once when several instances run.</w:t>
             </w:r>
           </w:p>
         </w:tc>
@@ -22175,6 +22175,77 @@
                 <w:szCs w:val="16"/>
               </w:rPr>
               <w:t xml:space="preserve">Msingi platform console: institutions, NACTVET catalogue, platform users, integration health.</w:t>
+            </w:r>
+          </w:p>
+        </w:tc>
+      </w:tr>
+      <w:tr>
+        <w:trPr>
+          <w:cantSplit/>
+        </w:trPr>
+        <w:tc>
+          <w:tcPr>
+            <w:tcW w:type="dxa" w:w="2166"/>
+            <w:tcBorders>
+              <w:top w:val="single" w:color="BFC9D6" w:sz="4"/>
+              <w:left w:val="single" w:color="BFC9D6" w:sz="4"/>
+              <w:bottom w:val="single" w:color="BFC9D6" w:sz="4"/>
+              <w:right w:val="single" w:color="BFC9D6" w:sz="4"/>
+            </w:tcBorders>
+            <w:tcMar>
+              <w:top w:type="dxa" w:w="60"/>
+              <w:left w:type="dxa" w:w="100"/>
+              <w:bottom w:type="dxa" w:w="60"/>
+              <w:right w:type="dxa" w:w="100"/>
+            </w:tcMar>
+            <w:vAlign w:val="center"/>
+          </w:tcPr>
+          <w:p>
+            <w:pPr>
+              <w:spacing w:after="30" w:before="30"/>
+              <w:jc w:val="left"/>
+            </w:pPr>
+            <w:r>
+              <w:rPr>
+                <w:rFonts w:ascii="Calibri" w:cs="Calibri" w:eastAsia="Calibri" w:hAnsi="Calibri"/>
+                <w:b/>
+                <w:bCs/>
+                <w:sz w:val="16"/>
+                <w:szCs w:val="16"/>
+              </w:rPr>
+              <w:t xml:space="preserve">console.billing</w:t>
+            </w:r>
+          </w:p>
+        </w:tc>
+        <w:tc>
+          <w:tcPr>
+            <w:tcW w:type="dxa" w:w="6860"/>
+            <w:tcBorders>
+              <w:top w:val="single" w:color="BFC9D6" w:sz="4"/>
+              <w:left w:val="single" w:color="BFC9D6" w:sz="4"/>
+              <w:bottom w:val="single" w:color="BFC9D6" w:sz="4"/>
+              <w:right w:val="single" w:color="BFC9D6" w:sz="4"/>
+            </w:tcBorders>
+            <w:tcMar>
+              <w:top w:type="dxa" w:w="60"/>
+              <w:left w:type="dxa" w:w="100"/>
+              <w:bottom w:type="dxa" w:w="60"/>
+              <w:right w:type="dxa" w:w="100"/>
+            </w:tcMar>
+            <w:vAlign w:val="center"/>
+          </w:tcPr>
+          <w:p>
+            <w:pPr>
+              <w:spacing w:after="30" w:before="30"/>
+              <w:jc w:val="left"/>
+            </w:pPr>
+            <w:r>
+              <w:rPr>
+                <w:rFonts w:ascii="Calibri" w:cs="Calibri" w:eastAsia="Calibri" w:hAnsi="Calibri"/>
+                <w:sz w:val="16"/>
+                <w:szCs w:val="16"/>
+              </w:rPr>
+              <w:t xml:space="preserve">Msingi billing: contracts, invoices prepared by the daily job, payments recorded or reported by Msingi's payment collector (signed notifications), credit, statements, reminders and suspension for non-payment; invoice, receipt and statement PDFs; the institution administrators' subscription page.</w:t>
             </w:r>
           </w:p>
         </w:tc>

</xml_diff>